<commit_message>
Update code, so tay han
</commit_message>
<xml_diff>
--- a/01_so_tay/so_tay_mini/templates/docx/so_tay_a5_cover.docx
+++ b/01_so_tay/so_tay_mini/templates/docx/so_tay_a5_cover.docx
@@ -80,7 +80,16 @@
           <w:sz w:val="40"/>
           <w:szCs w:val="36"/>
         </w:rPr>
-        <w:t>TỪ VỰNG N5</w:t>
+        <w:t>TỪ VỰNG N</w:t>
+      </w:r>
+      <w:r>
+        <w:rPr>
+          <w:b/>
+          <w:bCs/>
+          <w:sz w:val="40"/>
+          <w:szCs w:val="36"/>
+        </w:rPr>
+        <w:t>4</w:t>
       </w:r>
     </w:p>
     <w:p>

</xml_diff>